<commit_message>
feat: finalisasi smart logistics pipeline
</commit_message>
<xml_diff>
--- a/Proposal final project.docx
+++ b/Proposal final project.docx
@@ -11,12 +11,7 @@
         </w:rPr>
       </w:pPr>
       <w:r>
-        <w:rPr>
-          <w:b/>
-          <w:bCs/>
-          <w:lang w:val="en-ID"/>
-        </w:rPr>
-        <w:t>Problem Statement</w:t>
+        <w:t>Pernyataan Masalah</w:t>
       </w:r>
     </w:p>
     <w:p>
@@ -126,12 +121,7 @@
         </w:rPr>
       </w:pPr>
       <w:r>
-        <w:rPr>
-          <w:b/>
-          <w:bCs/>
-          <w:lang w:val="en-ID"/>
-        </w:rPr>
-        <w:t>Tidak ada mekanisme otomatis untuk memberi insentif kepada driver yang tetap bekerja di kondisi sulit, sehingga retensi driver di kondisi tersebut rendah</w:t>
+        <w:t>Belum tersedia mekanisme terintegrasi untuk menghubungkan kondisi lingkungan dengan data operasional dalam satu pipeline analitik</w:t>
       </w:r>
     </w:p>
     <w:p>
@@ -243,12 +233,7 @@
         </w:rPr>
       </w:pPr>
       <w:r>
-        <w:rPr>
-          <w:b/>
-          <w:bCs/>
-          <w:lang w:val="en-ID"/>
-        </w:rPr>
-        <w:t>Menjaga kesejahteraan &amp; retensi driver dengan sistem insentif otomatis berbasis kondisi kerja ekstrem yang terukur, bukan estimasi manual</w:t>
+        <w:t>Menyediakan informasi risiko operasional yang dapat menjadi dasar evaluasi kondisi kerja dan keputusan operasional; mekanisme insentif driver tidak menjadi deliverable utama pada implementasi ini</w:t>
       </w:r>
     </w:p>
     <w:p>
@@ -264,12 +249,7 @@
         </w:rPr>
       </w:pPr>
       <w:r>
-        <w:rPr>
-          <w:b/>
-          <w:bCs/>
-          <w:lang w:val="en-ID"/>
-        </w:rPr>
-        <w:t>Mengurangi keterlambatan pengiriman dengan notifikasi dini ke driver saat memasuki area berisiko, memungkinkan mereka menyesuaikan rute lebih awal</w:t>
+        <w:t>Mengurangi keterlambatan pengiriman dengan menyediakan visibilitas risiko yang lebih cepat kepada tim operasional sehingga penyesuaian proses dapat dilakukan berdasarkan data</w:t>
       </w:r>
     </w:p>
     <w:p>
@@ -321,11 +301,6 @@
         </w:rPr>
       </w:pPr>
       <w:r>
-        <w:rPr>
-          <w:b/>
-          <w:bCs/>
-          <w:lang w:val="en-ID"/>
-        </w:rPr>
         <w:t>Pertanyaan Bisnis yang Dijawab Dashboard</w:t>
       </w:r>
     </w:p>
@@ -458,12 +433,7 @@
         </w:rPr>
       </w:pPr>
       <w:r>
-        <w:rPr>
-          <w:b/>
-          <w:bCs/>
-          <w:lang w:val="en-ID"/>
-        </w:rPr>
-        <w:t>Rekomendasi Chart (minimal 2, sesuai requirement)</w:t>
+        <w:t>Rekomendasi Grafik (minimal 2, sesuai persyaratan)</w:t>
       </w:r>
     </w:p>
     <w:tbl>
@@ -734,12 +704,7 @@
         </w:rPr>
       </w:pPr>
       <w:r>
-        <w:rPr>
-          <w:b/>
-          <w:bCs/>
-          <w:lang w:val="en-ID"/>
-        </w:rPr>
-        <w:t>Kaitan dengan Requirement Teknis Mentor</w:t>
+        <w:t>Kaitan dengan Persyaratan Teknis Mentor</w:t>
       </w:r>
     </w:p>
     <w:p>
@@ -794,30 +759,7 @@
         </w:rPr>
       </w:pPr>
       <w:r>
-        <w:rPr>
-          <w:b/>
-          <w:bCs/>
-          <w:lang w:val="en-ID"/>
-        </w:rPr>
-        <w:t xml:space="preserve">Alert saat pipeline fail → Airflow task failure notification (email/Slack) kalau job Dataflow atau </w:t>
-      </w:r>
-      <w:proofErr w:type="spellStart"/>
-      <w:r>
-        <w:rPr>
-          <w:b/>
-          <w:bCs/>
-          <w:lang w:val="en-ID"/>
-        </w:rPr>
-        <w:t>dbt</w:t>
-      </w:r>
-      <w:proofErr w:type="spellEnd"/>
-      <w:r>
-        <w:rPr>
-          <w:b/>
-          <w:bCs/>
-          <w:lang w:val="en-ID"/>
-        </w:rPr>
-        <w:t xml:space="preserve"> run gagal</w:t>
+        <w:t>Alert saat pipeline fail → Airflow task failure callback untuk memberi notifikasi ketika task pipeline gagal</w:t>
       </w:r>
     </w:p>
     <w:p>
@@ -1006,12 +948,6 @@
         </w:rPr>
       </w:pPr>
       <w:r>
-        <w:rPr>
-          <w:b/>
-          <w:bCs/>
-          <w:lang w:val="en-ID"/>
-        </w:rPr>
-        <w:lastRenderedPageBreak/>
         <w:t>Penjelasan Detail Arsitektur</w:t>
       </w:r>
     </w:p>
@@ -1236,39 +1172,9 @@
         </w:rPr>
       </w:pPr>
       <w:r>
-        <w:rPr>
-          <w:b/>
-          <w:bCs/>
-          <w:lang w:val="en-ID"/>
-        </w:rPr>
-        <w:t>3. GCS (data lake) — raw storage</w:t>
-      </w:r>
-      <w:r>
-        <w:rPr>
-          <w:b/>
-          <w:bCs/>
-          <w:lang w:val="en-ID"/>
-        </w:rPr>
+        <w:t>3. GCS (data lake) — penyimpanan data mentah</w:t>
         <w:br/>
-        <w:t xml:space="preserve">Semua data mentah (belum diolah) dari kedua jalur ingestion mendarat di sini dalam format asli (JSON/CSV). Fungsinya sebagai staging area — kalau ada error di proses berikutnya, data mentah masih bisa </w:t>
-      </w:r>
-      <w:proofErr w:type="spellStart"/>
-      <w:r>
-        <w:rPr>
-          <w:b/>
-          <w:bCs/>
-          <w:lang w:val="en-ID"/>
-        </w:rPr>
-        <w:t>direproses</w:t>
-      </w:r>
-      <w:proofErr w:type="spellEnd"/>
-      <w:r>
-        <w:rPr>
-          <w:b/>
-          <w:bCs/>
-          <w:lang w:val="en-ID"/>
-        </w:rPr>
-        <w:t xml:space="preserve"> tanpa harus ambil ulang dari API.</w:t>
+        <w:t>Semua data mentah (belum diolah) dari kedua jalur ingestion mendarat di sini dalam format asli (JSON/CSV). Fungsinya sebagai staging area — kalau ada error di proses berikutnya, data mentah masih bisa direproses tanpa harus ambil ulang dari API.</w:t>
       </w:r>
     </w:p>
     <w:p>
@@ -1440,12 +1346,7 @@
         </w:rPr>
       </w:pPr>
       <w:r>
-        <w:rPr>
-          <w:b/>
-          <w:bCs/>
-          <w:lang w:val="en-ID"/>
-        </w:rPr>
-        <w:t>6. Output/Serving — 3 use case bisnis</w:t>
+        <w:t>6. Output/Serving — dashboard dan monitoring pipeline</w:t>
       </w:r>
     </w:p>
     <w:p>
@@ -1503,82 +1404,39 @@
         </w:rPr>
       </w:pPr>
       <w:r>
-        <w:rPr>
-          <w:b/>
-          <w:bCs/>
-          <w:lang w:val="en-ID"/>
-        </w:rPr>
-        <w:t>Dashboard ops — visualisasi untuk tim monitoring via Looker Studio/</w:t>
-      </w:r>
-      <w:proofErr w:type="spellStart"/>
-      <w:r>
-        <w:rPr>
-          <w:b/>
-          <w:bCs/>
-          <w:lang w:val="en-ID"/>
-        </w:rPr>
-        <w:t>Metabase</w:t>
-      </w:r>
-      <w:proofErr w:type="spellEnd"/>
-    </w:p>
-    <w:p>
-      <w:pPr>
-        <w:rPr>
-          <w:b/>
-          <w:bCs/>
-          <w:lang w:val="en-ID"/>
-        </w:rPr>
-      </w:pPr>
-      <w:r>
-        <w:rPr>
-          <w:b/>
-          <w:bCs/>
-          <w:lang w:val="en-ID"/>
-        </w:rPr>
-        <w:t xml:space="preserve">Orchestrator: Airflow (Cloud Composer) mengatur semuanya di background — kapan trigger job Dataflow, kapan jalankan </w:t>
-      </w:r>
-      <w:proofErr w:type="spellStart"/>
-      <w:r>
-        <w:rPr>
-          <w:b/>
-          <w:bCs/>
-          <w:lang w:val="en-ID"/>
-        </w:rPr>
-        <w:t>dbt</w:t>
-      </w:r>
-      <w:proofErr w:type="spellEnd"/>
-      <w:r>
-        <w:rPr>
-          <w:b/>
-          <w:bCs/>
-          <w:lang w:val="en-ID"/>
-        </w:rPr>
-        <w:t xml:space="preserve"> run, kapan polling BMKG — meskipun tidak digambar sebagai node terpisah di setiap tahap.</w:t>
-      </w:r>
-    </w:p>
-    <w:p>
-      <w:pPr>
-        <w:rPr>
-          <w:b/>
-          <w:bCs/>
-          <w:lang w:val="en-ID"/>
-        </w:rPr>
-      </w:pPr>
-    </w:p>
-    <w:p>
-      <w:pPr>
-        <w:rPr>
-          <w:b/>
-          <w:bCs/>
-          <w:lang w:val="en-ID"/>
-        </w:rPr>
-      </w:pPr>
-      <w:r>
-        <w:rPr>
-          <w:b/>
-          <w:bCs/>
-          <w:lang w:val="en-ID"/>
-        </w:rPr>
+        <w:t>Dashboard ops — visualisasi untuk tim monitoring melalui Looker Studio</w:t>
+      </w:r>
+    </w:p>
+    <w:p>
+      <w:pPr>
+        <w:rPr>
+          <w:b/>
+          <w:bCs/>
+          <w:lang w:val="en-ID"/>
+        </w:rPr>
+      </w:pPr>
+      <w:r>
+        <w:t>Orchestrator: Airflow mengatur proses batch, menjalankan task ingestion/transformasi, menjalankan dbt, dan memantau kegagalan pipeline. Cloud Composer tidak diperlukan untuk implementasi proyek ini.</w:t>
+      </w:r>
+    </w:p>
+    <w:p>
+      <w:pPr>
+        <w:rPr>
+          <w:b/>
+          <w:bCs/>
+          <w:lang w:val="en-ID"/>
+        </w:rPr>
+      </w:pPr>
+    </w:p>
+    <w:p>
+      <w:pPr>
+        <w:rPr>
+          <w:b/>
+          <w:bCs/>
+          <w:lang w:val="en-ID"/>
+        </w:rPr>
+      </w:pPr>
+      <w:r>
         <w:t>15 Pertanyaan untuk Mentor</w:t>
       </w:r>
     </w:p>
@@ -1775,43 +1633,7 @@
         </w:rPr>
       </w:pPr>
       <w:r>
-        <w:rPr>
-          <w:highlight w:val="yellow"/>
-          <w:lang w:val="en-ID"/>
-        </w:rPr>
-        <w:t xml:space="preserve">Untuk notifikasi driver yang butuh real-time, apakah </w:t>
-      </w:r>
-      <w:proofErr w:type="spellStart"/>
-      <w:r>
-        <w:rPr>
-          <w:highlight w:val="yellow"/>
-          <w:lang w:val="en-ID"/>
-        </w:rPr>
-        <w:t>dbt</w:t>
-      </w:r>
-      <w:proofErr w:type="spellEnd"/>
-      <w:r>
-        <w:rPr>
-          <w:highlight w:val="yellow"/>
-          <w:lang w:val="en-ID"/>
-        </w:rPr>
-        <w:t>/</w:t>
-      </w:r>
-      <w:proofErr w:type="spellStart"/>
-      <w:r>
-        <w:rPr>
-          <w:highlight w:val="yellow"/>
-          <w:lang w:val="en-ID"/>
-        </w:rPr>
-        <w:t>BigQuery</w:t>
-      </w:r>
-      <w:proofErr w:type="spellEnd"/>
-      <w:r>
-        <w:rPr>
-          <w:highlight w:val="yellow"/>
-          <w:lang w:val="en-ID"/>
-        </w:rPr>
-        <w:t xml:space="preserve"> dianggap cukup, atau mentor menyarankan jalur terpisah langsung dari Dataflow (trade-off latency vs kompleksitas)?</w:t>
+        <w:t>Untuk alert kegagalan pipeline, apakah callback Airflow dengan webhook sudah cukup, atau mentor menyarankan integrasi tertentu seperti email/Slack/Google Chat?</w:t>
       </w:r>
     </w:p>
     <w:p>

</xml_diff>